<commit_message>
feat(p4): contracts carry a product; pepper trucks use pepper contracts
Contract.product_type (nullable, NULL = tomato) with backfill; one-time
contracts inherit the shipment's product; framework options and links are
filtered by the truck's product; the KZ contract .docx prints the product's
RU/TK names via product_names().

Co-Authored-By: Claude Sonnet 5.5 <noreply@anthropic.com>
</commit_message>
<xml_diff>
--- a/backend/apps/contracts/document_templates/contract_kz.docx
+++ b/backend/apps/contracts/document_templates/contract_kz.docx
@@ -8865,22 +8865,8 @@
               </w:rPr>
             </w:pPr>
             <w:r>
-              <w:t>Томаты</w:t>
-            </w:r>
-            <w:r>
-              <w:rPr>
-                <w:lang w:val="en-US"/>
-              </w:rPr>
-              <w:t xml:space="preserve">/ </w:t>
-            </w:r>
-            <w:proofErr w:type="spellStart"/>
-            <w:r>
-              <w:rPr>
-                <w:lang w:val="en-US"/>
-              </w:rPr>
-              <w:t>Pomidor</w:t>
-            </w:r>
-            <w:proofErr w:type="spellEnd"/>
+              <w:t>{{ product_name_ru }}/ {{ product_name_tk }}</w:t>
+            </w:r>
           </w:p>
         </w:tc>
         <w:tc>

</xml_diff>